<commit_message>
napisano poglavlje o analizi i obradi podataka u izvjestaju, dodane nove stavke u skriptu za analizu podataka
</commit_message>
<xml_diff>
--- a/Izvjestaj_projekta - Radna verzija.docx
+++ b/Izvjestaj_projekta - Radna verzija.docx
@@ -274,14 +274,7 @@
           <w:sz w:val="18"/>
           <w:szCs w:val="18"/>
         </w:rPr>
-        <w:t>Karlovac</w:t>
-      </w:r>
-      <w:r>
-        <w:rPr>
-          <w:sz w:val="18"/>
-          <w:szCs w:val="18"/>
-        </w:rPr>
-        <w:t>, Hrvatska</w:t>
+        <w:t>Karlovac, Hrvatska</w:t>
       </w:r>
       <w:r>
         <w:rPr>
@@ -342,327 +335,127 @@
         <w:t>—</w:t>
       </w:r>
       <w:r>
-        <w:t xml:space="preserve">Rak </w:t>
-      </w:r>
-      <w:proofErr w:type="spellStart"/>
-      <w:r>
-        <w:t>dojke</w:t>
-      </w:r>
-      <w:proofErr w:type="spellEnd"/>
-      <w:r>
-        <w:t xml:space="preserve"> je </w:t>
-      </w:r>
-      <w:proofErr w:type="spellStart"/>
-      <w:r>
-        <w:t>bolest</w:t>
-      </w:r>
-      <w:proofErr w:type="spellEnd"/>
+        <w:t>Rak dojke je bolest koja se manifestira u prekomjernom rastu abnormalnih stanica dojke. Značajna dijagnostička metoda za rak dojke je ultrazvuk, što je neinvazivna medicinska pretraga koja snima ljudsko tijelo pomoću zvučnih valova visoke frekvencije.</w:t>
+      </w:r>
+    </w:p>
+    <w:p>
+      <w:pPr>
+        <w:pStyle w:val="Keywords"/>
+      </w:pPr>
+      <w:r>
+        <w:t>Keywords—</w:t>
+      </w:r>
+      <w:r>
+        <w:t>rak dojke, ultrazvuk, duboko učenje, neuronske mreže, programski jezik Python, Jupyter Notebooks</w:t>
+      </w:r>
+    </w:p>
+    <w:p>
+      <w:pPr>
+        <w:pStyle w:val="Heading1"/>
+      </w:pPr>
+      <w:r>
+        <w:t>Uvod</w:t>
+      </w:r>
+    </w:p>
+    <w:p>
+      <w:pPr>
+        <w:pStyle w:val="BodyText"/>
+      </w:pPr>
+      <w:r>
+        <w:t xml:space="preserve">Rak dojke je </w:t>
+      </w:r>
+      <w:r>
+        <w:t xml:space="preserve">tip bolesti pri kojoj abnormalne stanice dojke nekontrolirano rastu i stvaraju tumore. Ako se ne kontroliraju, tumori se mogu proširiti po ostatku tijela i, s vremenom, biti fatalni [1]. </w:t>
+      </w:r>
+    </w:p>
+    <w:p>
+      <w:pPr>
+        <w:pStyle w:val="BodyText"/>
+      </w:pPr>
+      <w:r>
+        <w:t xml:space="preserve">Uzrok nastanka raka dojke uglavnom je nepoznat. Od </w:t>
+      </w:r>
+      <w:r>
+        <w:t>njega n</w:t>
+      </w:r>
+      <w:r>
+        <w:t>ajčešće obolijevaju žene iznad pedesete godine života, a muškarci također mogu oboljeti od raka dojke, ali znatno rjeđe nego žene</w:t>
+      </w:r>
+      <w:r>
+        <w:t>. Najznačajniji čimbenici koji povećavaju rizik nastanka raka dojke su: dob, prva menstruacija prije 12-te godine života, menopauza nakon 50-te godine života, nerađanje ili rađanje poslije 30-te godine života, pojavnost raka dojk</w:t>
+      </w:r>
+      <w:r>
+        <w:t>e</w:t>
+      </w:r>
+      <w:r>
+        <w:t xml:space="preserve"> i/ili raka jajnika kod bližih srodnika</w:t>
+      </w:r>
+      <w:r>
+        <w:t xml:space="preserve"> te</w:t>
+      </w:r>
+      <w:r>
+        <w:t xml:space="preserve"> prethodna bolest dojke. Također, povećani rizik za rak dojke vezan je i uz određene životne navike i stil života koji se smatraju nezdravim: prehrana bogata masnoćama i šećerima, pretilost, povećana konzumacija alkohola, pušenje</w:t>
+      </w:r>
+      <w:r>
+        <w:t xml:space="preserve"> te</w:t>
+      </w:r>
+      <w:r>
+        <w:t xml:space="preserve"> izloženost radioaktivnom zračenju</w:t>
+      </w:r>
       <w:r>
         <w:t xml:space="preserve"> </w:t>
       </w:r>
-      <w:proofErr w:type="spellStart"/>
-      <w:r>
-        <w:t>koja</w:t>
-      </w:r>
-      <w:proofErr w:type="spellEnd"/>
-      <w:r>
-        <w:t xml:space="preserve"> se </w:t>
-      </w:r>
-      <w:proofErr w:type="spellStart"/>
-      <w:r>
-        <w:t>manifestira</w:t>
-      </w:r>
-      <w:proofErr w:type="spellEnd"/>
-      <w:r>
-        <w:t xml:space="preserve"> u </w:t>
-      </w:r>
-      <w:proofErr w:type="spellStart"/>
-      <w:r>
-        <w:t>prekomjernom</w:t>
-      </w:r>
-      <w:proofErr w:type="spellEnd"/>
+      <w:r>
+        <w:t>[2].</w:t>
+      </w:r>
+    </w:p>
+    <w:p>
+      <w:pPr>
+        <w:pStyle w:val="BodyText"/>
+      </w:pPr>
+      <w:r>
+        <w:t xml:space="preserve">Mnogi pacijenti oboljeli od raka dojke ne </w:t>
+      </w:r>
+      <w:r>
+        <w:t>primijete</w:t>
+      </w:r>
+      <w:r>
+        <w:t xml:space="preserve"> ikakve simptome u ranijim stadijima bolesti, zbog čega je bitno rano otkrivanje bolesti. Simptomi raka dojke mogu uključivati: </w:t>
+      </w:r>
+      <w:r>
+        <w:t xml:space="preserve">bezbolnu kvržicu na grudima, promjenu oblika ili izgleda dojke, stvaranje udubljenja, crvenila ili drugih promjena na koži, promjene u izgledu bradavice (areole) ili kože oko nje te abnormalni ili krvavi iscjedak iz bradavice [1]. </w:t>
+      </w:r>
+    </w:p>
+    <w:p>
+      <w:pPr>
+        <w:pStyle w:val="BodyText"/>
+      </w:pPr>
+      <w:r>
+        <w:t>Postoje dva najčešća načina dijagnosticiranja raka dojke: mamografija i ultrazvuk dojke. Mamografija je rendgenski pregled dojki kojim se otkrivaju tumori i druge promjene dojke koje su premalene da bi se mogle napipati.</w:t>
+      </w:r>
+      <w:r>
+        <w:t xml:space="preserve"> Ultrazvuk je radiološka dijagnostička metoda koja za snimanja koristi zvuk visoke frekvencije</w:t>
+      </w:r>
+      <w:r>
+        <w:t>. Smatra se potpuno ne</w:t>
+      </w:r>
+      <w:r>
+        <w:t>škodljivom</w:t>
+      </w:r>
+      <w:r>
+        <w:t xml:space="preserve"> metodom, pri čemu nema izlaganja ionizirajućim zračenjima</w:t>
+      </w:r>
+      <w:r>
+        <w:t xml:space="preserve"> [2]. U medicinskom ultrazvuku koriste se longitudinalni</w:t>
+      </w:r>
       <w:r>
         <w:t xml:space="preserve"> </w:t>
       </w:r>
-      <w:proofErr w:type="spellStart"/>
-      <w:r>
-        <w:t>rastu</w:t>
-      </w:r>
-      <w:proofErr w:type="spellEnd"/>
-      <w:r>
-        <w:t xml:space="preserve"> </w:t>
-      </w:r>
-      <w:proofErr w:type="spellStart"/>
-      <w:r>
-        <w:t>abnormalnih</w:t>
-      </w:r>
-      <w:proofErr w:type="spellEnd"/>
-      <w:r>
-        <w:t xml:space="preserve"> </w:t>
-      </w:r>
-      <w:proofErr w:type="spellStart"/>
-      <w:r>
-        <w:t>stanica</w:t>
-      </w:r>
-      <w:proofErr w:type="spellEnd"/>
-      <w:r>
-        <w:t xml:space="preserve"> </w:t>
-      </w:r>
-      <w:proofErr w:type="spellStart"/>
-      <w:r>
-        <w:t>dojke</w:t>
-      </w:r>
-      <w:proofErr w:type="spellEnd"/>
-      <w:r>
-        <w:t xml:space="preserve">. </w:t>
-      </w:r>
-      <w:proofErr w:type="spellStart"/>
-      <w:r>
-        <w:t>Značajna</w:t>
-      </w:r>
-      <w:proofErr w:type="spellEnd"/>
-      <w:r>
-        <w:t xml:space="preserve"> </w:t>
-      </w:r>
-      <w:proofErr w:type="spellStart"/>
-      <w:r>
-        <w:t>dijagnostička</w:t>
-      </w:r>
-      <w:proofErr w:type="spellEnd"/>
-      <w:r>
-        <w:t xml:space="preserve"> </w:t>
-      </w:r>
-      <w:proofErr w:type="spellStart"/>
-      <w:r>
-        <w:t>metoda</w:t>
-      </w:r>
-      <w:proofErr w:type="spellEnd"/>
-      <w:r>
-        <w:t xml:space="preserve"> za </w:t>
-      </w:r>
-      <w:proofErr w:type="spellStart"/>
-      <w:r>
-        <w:t>rak</w:t>
-      </w:r>
-      <w:proofErr w:type="spellEnd"/>
-      <w:r>
-        <w:t xml:space="preserve"> </w:t>
-      </w:r>
-      <w:proofErr w:type="spellStart"/>
-      <w:r>
-        <w:t>dojke</w:t>
-      </w:r>
-      <w:proofErr w:type="spellEnd"/>
-      <w:r>
-        <w:t xml:space="preserve"> je </w:t>
-      </w:r>
-      <w:proofErr w:type="spellStart"/>
-      <w:r>
-        <w:t>ultrazvuk</w:t>
-      </w:r>
-      <w:proofErr w:type="spellEnd"/>
-      <w:r>
-        <w:t xml:space="preserve">, </w:t>
-      </w:r>
-      <w:proofErr w:type="spellStart"/>
-      <w:r>
-        <w:t>što</w:t>
-      </w:r>
-      <w:proofErr w:type="spellEnd"/>
-      <w:r>
-        <w:t xml:space="preserve"> je </w:t>
-      </w:r>
-      <w:proofErr w:type="spellStart"/>
-      <w:r>
-        <w:t>neinvazivna</w:t>
-      </w:r>
-      <w:proofErr w:type="spellEnd"/>
-      <w:r>
-        <w:t xml:space="preserve"> </w:t>
-      </w:r>
-      <w:proofErr w:type="spellStart"/>
-      <w:r>
-        <w:t>medicinska</w:t>
-      </w:r>
-      <w:proofErr w:type="spellEnd"/>
-      <w:r>
-        <w:t xml:space="preserve"> </w:t>
-      </w:r>
-      <w:proofErr w:type="spellStart"/>
-      <w:r>
-        <w:t>pretraga</w:t>
-      </w:r>
-      <w:proofErr w:type="spellEnd"/>
-      <w:r>
-        <w:t xml:space="preserve"> </w:t>
-      </w:r>
-      <w:proofErr w:type="spellStart"/>
-      <w:r>
-        <w:t>koja</w:t>
-      </w:r>
-      <w:proofErr w:type="spellEnd"/>
-      <w:r>
-        <w:t xml:space="preserve"> </w:t>
-      </w:r>
-      <w:proofErr w:type="spellStart"/>
-      <w:r>
-        <w:t>snima</w:t>
-      </w:r>
-      <w:proofErr w:type="spellEnd"/>
-      <w:r>
-        <w:t xml:space="preserve"> </w:t>
-      </w:r>
-      <w:proofErr w:type="spellStart"/>
-      <w:r>
-        <w:t>ljudsko</w:t>
-      </w:r>
-      <w:proofErr w:type="spellEnd"/>
-      <w:r>
-        <w:t xml:space="preserve"> </w:t>
-      </w:r>
-      <w:proofErr w:type="spellStart"/>
-      <w:r>
-        <w:t>tijelo</w:t>
-      </w:r>
-      <w:proofErr w:type="spellEnd"/>
-      <w:r>
-        <w:t xml:space="preserve"> </w:t>
-      </w:r>
-      <w:proofErr w:type="spellStart"/>
-      <w:r>
-        <w:t>pomoću</w:t>
-      </w:r>
-      <w:proofErr w:type="spellEnd"/>
-      <w:r>
-        <w:t xml:space="preserve"> </w:t>
-      </w:r>
-      <w:proofErr w:type="spellStart"/>
-      <w:r>
-        <w:t>zvučnih</w:t>
-      </w:r>
-      <w:proofErr w:type="spellEnd"/>
-      <w:r>
-        <w:t xml:space="preserve"> </w:t>
-      </w:r>
-      <w:proofErr w:type="spellStart"/>
-      <w:r>
-        <w:t>valova</w:t>
-      </w:r>
-      <w:proofErr w:type="spellEnd"/>
-      <w:r>
-        <w:t xml:space="preserve"> </w:t>
-      </w:r>
-      <w:proofErr w:type="spellStart"/>
-      <w:r>
-        <w:t>visoke</w:t>
-      </w:r>
-      <w:proofErr w:type="spellEnd"/>
-      <w:r>
-        <w:t xml:space="preserve"> </w:t>
-      </w:r>
-      <w:proofErr w:type="spellStart"/>
-      <w:r>
-        <w:t>frekvencije</w:t>
-      </w:r>
-      <w:proofErr w:type="spellEnd"/>
-      <w:r>
-        <w:t>.</w:t>
-      </w:r>
-    </w:p>
-    <w:p>
-      <w:pPr>
-        <w:pStyle w:val="Keywords"/>
-      </w:pPr>
-      <w:r>
-        <w:t>Keywords—</w:t>
-      </w:r>
-      <w:proofErr w:type="spellStart"/>
-      <w:r>
-        <w:t>rak</w:t>
-      </w:r>
-      <w:proofErr w:type="spellEnd"/>
-      <w:r>
-        <w:t xml:space="preserve"> </w:t>
-      </w:r>
-      <w:proofErr w:type="spellStart"/>
-      <w:r>
-        <w:t>dojke</w:t>
-      </w:r>
-      <w:proofErr w:type="spellEnd"/>
-      <w:r>
-        <w:t xml:space="preserve">, </w:t>
-      </w:r>
-      <w:proofErr w:type="spellStart"/>
-      <w:r>
-        <w:t>ultrazvuk</w:t>
-      </w:r>
-      <w:proofErr w:type="spellEnd"/>
-      <w:r>
-        <w:t xml:space="preserve">, </w:t>
-      </w:r>
-      <w:proofErr w:type="spellStart"/>
-      <w:r>
-        <w:t>duboko</w:t>
-      </w:r>
-      <w:proofErr w:type="spellEnd"/>
-      <w:r>
-        <w:t xml:space="preserve"> </w:t>
-      </w:r>
-      <w:proofErr w:type="spellStart"/>
-      <w:r>
-        <w:t>učenje</w:t>
-      </w:r>
-      <w:proofErr w:type="spellEnd"/>
-      <w:r>
-        <w:t xml:space="preserve">, </w:t>
-      </w:r>
-      <w:proofErr w:type="spellStart"/>
-      <w:r>
-        <w:t>neuronske</w:t>
-      </w:r>
-      <w:proofErr w:type="spellEnd"/>
-      <w:r>
-        <w:t xml:space="preserve"> </w:t>
-      </w:r>
-      <w:proofErr w:type="spellStart"/>
-      <w:r>
-        <w:t>mreže</w:t>
-      </w:r>
-      <w:proofErr w:type="spellEnd"/>
-      <w:r>
-        <w:t xml:space="preserve">, </w:t>
-      </w:r>
-      <w:proofErr w:type="spellStart"/>
-      <w:r>
-        <w:t>programski</w:t>
-      </w:r>
-      <w:proofErr w:type="spellEnd"/>
-      <w:r>
-        <w:t xml:space="preserve"> </w:t>
-      </w:r>
-      <w:proofErr w:type="spellStart"/>
-      <w:r>
-        <w:t>jezik</w:t>
-      </w:r>
-      <w:proofErr w:type="spellEnd"/>
-      <w:r>
-        <w:t xml:space="preserve"> Python, </w:t>
-      </w:r>
-      <w:proofErr w:type="spellStart"/>
-      <w:r>
-        <w:t>Jupyter</w:t>
-      </w:r>
-      <w:proofErr w:type="spellEnd"/>
-      <w:r>
-        <w:t xml:space="preserve"> Notebooks</w:t>
-      </w:r>
-    </w:p>
-    <w:p>
-      <w:pPr>
-        <w:pStyle w:val="Heading1"/>
-      </w:pPr>
-      <w:r>
-        <w:t>Uvod</w:t>
+      <w:r>
+        <w:t xml:space="preserve">valovi frekvencija većih od 2,5 MHz [3]. </w:t>
+      </w:r>
+      <w:r>
+        <w:t>Ultrazvuk, uz mamografiju, znatno povećava točnost dijagnosticiranja dobroćudnih i zloćudnih bolesti dojke [2].</w:t>
       </w:r>
     </w:p>
     <w:p>
@@ -670,199 +463,10 @@
         <w:pStyle w:val="BodyText"/>
       </w:pPr>
       <w:r>
-        <w:t xml:space="preserve">Rak dojke je </w:t>
-      </w:r>
-      <w:r>
-        <w:t xml:space="preserve">tip bolesti pri kojoj abnormalne stanice dojke nekontrolirano rastu i stvaraju tumore. Ako se ne kontroliraju, tumori se mogu proširiti po ostatku tijela i, s vremenom, biti fatalni [1]. </w:t>
-      </w:r>
-    </w:p>
-    <w:p>
-      <w:pPr>
-        <w:pStyle w:val="BodyText"/>
-      </w:pPr>
-      <w:r>
-        <w:t xml:space="preserve">Uzrok nastanka raka dojke uglavnom je nepoznat. Od </w:t>
-      </w:r>
-      <w:r>
-        <w:t>njega n</w:t>
-      </w:r>
-      <w:r>
-        <w:t>ajčešće obolijevaju žene iznad pedesete godine života, a muškarci također mogu oboljeti od raka dojke, ali znatno rjeđe nego žene</w:t>
-      </w:r>
-      <w:r>
-        <w:t>. Najznačajniji čimbenici koji povećavaju rizik nastanka raka dojke su: dob, prva menstruacija prije 12-te godine života, menopauza nakon 50-te godine života, nerađanje ili rađanje poslije 30-te godine života, pojavnost raka dojk</w:t>
-      </w:r>
-      <w:r>
-        <w:t>e</w:t>
-      </w:r>
-      <w:r>
-        <w:t xml:space="preserve"> i/ili raka jajnika kod bližih srodnika</w:t>
-      </w:r>
-      <w:r>
-        <w:t xml:space="preserve"> te</w:t>
-      </w:r>
-      <w:r>
-        <w:t xml:space="preserve"> prethodna bolest dojke. Također, povećani rizik za rak dojke vezan je i uz određene životne navike i stil života koji se smatraju nezdravim: prehrana bogata masnoćama i šećerima, pretilost, povećana konzumacija alkohola, pušenje</w:t>
-      </w:r>
-      <w:r>
-        <w:t xml:space="preserve"> te</w:t>
-      </w:r>
-      <w:r>
-        <w:t xml:space="preserve"> izloženost radioaktivnom zračenju</w:t>
-      </w:r>
-      <w:r>
-        <w:t xml:space="preserve"> </w:t>
-      </w:r>
-      <w:r>
-        <w:t>[2].</w:t>
-      </w:r>
-    </w:p>
-    <w:p>
-      <w:pPr>
-        <w:pStyle w:val="BodyText"/>
-      </w:pPr>
-      <w:r>
-        <w:t xml:space="preserve">Mnogi pacijenti oboljeli od raka dojke ne </w:t>
-      </w:r>
-      <w:r>
-        <w:t>primijete</w:t>
-      </w:r>
-      <w:r>
-        <w:t xml:space="preserve"> ikakve simptome u ranijim stadijima bolesti, zbog čega je bitno rano otkrivanje bolesti. Simptomi raka dojke mogu uključivati: </w:t>
-      </w:r>
-      <w:r>
-        <w:t xml:space="preserve">bezbolnu kvržicu na grudima, promjenu oblika ili izgleda dojke, stvaranje udubljenja, crvenila ili drugih promjena na koži, promjene u </w:t>
-      </w:r>
-      <w:proofErr w:type="spellStart"/>
-      <w:r>
-        <w:t>izgledu</w:t>
-      </w:r>
-      <w:proofErr w:type="spellEnd"/>
-      <w:r>
-        <w:t xml:space="preserve"> </w:t>
-      </w:r>
-      <w:proofErr w:type="spellStart"/>
-      <w:r>
-        <w:t>bradavice</w:t>
-      </w:r>
-      <w:proofErr w:type="spellEnd"/>
-      <w:r>
-        <w:t xml:space="preserve"> (areole) </w:t>
-      </w:r>
-      <w:proofErr w:type="spellStart"/>
-      <w:r>
-        <w:t>ili</w:t>
-      </w:r>
-      <w:proofErr w:type="spellEnd"/>
-      <w:r>
-        <w:t xml:space="preserve"> </w:t>
-      </w:r>
-      <w:proofErr w:type="spellStart"/>
-      <w:r>
-        <w:t>kože</w:t>
-      </w:r>
-      <w:proofErr w:type="spellEnd"/>
-      <w:r>
-        <w:t xml:space="preserve"> </w:t>
-      </w:r>
-      <w:proofErr w:type="spellStart"/>
-      <w:r>
-        <w:t>oko</w:t>
-      </w:r>
-      <w:proofErr w:type="spellEnd"/>
-      <w:r>
-        <w:t xml:space="preserve"> nje te abnormalni ili krvavi iscjedak iz bradavice [1]. </w:t>
-      </w:r>
-    </w:p>
-    <w:p>
-      <w:pPr>
-        <w:pStyle w:val="BodyText"/>
-      </w:pPr>
-      <w:r>
-        <w:t>Postoje dva najčešća načina dijagnosticiranja raka dojke: mamografija i ultrazvuk dojke. Mamografija je rendgenski pregled dojki kojim se otkrivaju tumori i druge promjene dojke koje su premalene da bi se mogle napipati.</w:t>
-      </w:r>
-      <w:r>
-        <w:t xml:space="preserve"> Ultrazvuk je radiološka dijagnostička metoda koja za snimanja koristi zvuk visoke frekvencije</w:t>
-      </w:r>
-      <w:r>
-        <w:t>. Smatra se potpuno ne</w:t>
-      </w:r>
-      <w:r>
-        <w:t>škodljivom</w:t>
-      </w:r>
-      <w:r>
-        <w:t xml:space="preserve"> metodom, pri čemu nema izlaganja ionizirajućim zračenjima</w:t>
-      </w:r>
-      <w:r>
-        <w:t xml:space="preserve"> [2]. U medicinskom ultrazvuku koriste se longitudinalni</w:t>
-      </w:r>
-      <w:r>
-        <w:t xml:space="preserve"> </w:t>
-      </w:r>
-      <w:r>
-        <w:t xml:space="preserve">valovi frekvencija većih od 2,5 MHz [3]. </w:t>
-      </w:r>
-      <w:r>
-        <w:t>Ultrazvuk, uz mamografiju, znatno povećava točnost dijagnosticiranja dobroćudnih i zloćudnih bolesti dojke [2].</w:t>
-      </w:r>
-    </w:p>
-    <w:p>
-      <w:pPr>
-        <w:pStyle w:val="BodyText"/>
-      </w:pPr>
-      <w:r>
         <w:t xml:space="preserve">Ultrazvuk može procijeniti morfologiju, orijentaciju, unutarnju strukturu i rubove lezije iz više ravnina s visokom rezolucijom, kako u dojkama koje se sastoje od pretežno masnog tkiva, tako i u gustim žljezdanim strukturama. Opći kriteriji za otkrivanje raka dojke ultrazvukom navedeni su u </w:t>
       </w:r>
       <w:r>
-        <w:t xml:space="preserve">tablici 1. Među tim značajkama, najbitniji faktori pri klasificiranju lezija su: okolno tkivo, oblik, kontura ruba, </w:t>
-      </w:r>
-      <w:proofErr w:type="spellStart"/>
-      <w:r>
-        <w:t>granica</w:t>
-      </w:r>
-      <w:proofErr w:type="spellEnd"/>
-      <w:r>
-        <w:t xml:space="preserve"> </w:t>
-      </w:r>
-      <w:proofErr w:type="spellStart"/>
-      <w:r>
-        <w:t>lezije</w:t>
-      </w:r>
-      <w:proofErr w:type="spellEnd"/>
-      <w:r>
-        <w:t xml:space="preserve"> </w:t>
-      </w:r>
-      <w:proofErr w:type="spellStart"/>
-      <w:r>
-        <w:t>i</w:t>
-      </w:r>
-      <w:proofErr w:type="spellEnd"/>
-      <w:r>
-        <w:t xml:space="preserve"> </w:t>
-      </w:r>
-      <w:proofErr w:type="spellStart"/>
-      <w:r>
-        <w:t>posteriorne</w:t>
-      </w:r>
-      <w:proofErr w:type="spellEnd"/>
-      <w:r>
-        <w:t xml:space="preserve"> </w:t>
-      </w:r>
-      <w:proofErr w:type="spellStart"/>
-      <w:r>
-        <w:t>akustičke</w:t>
-      </w:r>
-      <w:proofErr w:type="spellEnd"/>
-      <w:r>
-        <w:t xml:space="preserve"> </w:t>
-      </w:r>
-      <w:proofErr w:type="spellStart"/>
-      <w:r>
-        <w:t>značajke</w:t>
-      </w:r>
-      <w:proofErr w:type="spellEnd"/>
-      <w:r>
-        <w:t xml:space="preserve"> [4].</w:t>
+        <w:t>tablici 1. Među tim značajkama, najbitniji faktori pri klasificiranju lezija su: okolno tkivo, oblik, kontura ruba, granica lezije i posteriorne akustičke značajke [4].</w:t>
       </w:r>
     </w:p>
     <w:p>
@@ -875,7 +479,7 @@
           <w:noProof/>
         </w:rPr>
         <w:drawing>
-          <wp:inline distT="0" distB="0" distL="0" distR="0" wp14:anchorId="7FB9EBF8" wp14:editId="184971E4">
+          <wp:inline distT="0" distB="0" distL="0" distR="0" wp14:anchorId="7FB9EBF8" wp14:editId="378EAFC0">
             <wp:extent cx="3089910" cy="2246630"/>
             <wp:effectExtent l="0" t="0" r="0" b="1270"/>
             <wp:docPr id="1016865219" name="Picture 2" descr="A screenshot of a medical chart&#10;&#10;Description automatically generated"/>
@@ -921,389 +525,822 @@
       <w:pPr>
         <w:pStyle w:val="Caption"/>
       </w:pPr>
-      <w:proofErr w:type="spellStart"/>
-      <w:r>
-        <w:t>Slika</w:t>
-      </w:r>
-      <w:proofErr w:type="spellEnd"/>
-      <w:r>
-        <w:t xml:space="preserve"> 1. </w:t>
-      </w:r>
-      <w:proofErr w:type="spellStart"/>
-      <w:r>
-        <w:t>Usporedba</w:t>
-      </w:r>
-      <w:proofErr w:type="spellEnd"/>
-      <w:r>
+      <w:r>
+        <w:t>Slika 1. Usporedba karakteristika malignih i benignih tumora prema karakteristikama vidljivim na slikama ultrazvuka</w:t>
+      </w:r>
+      <w:r>
+        <w:t xml:space="preserve"> [4]</w:t>
+      </w:r>
+    </w:p>
+    <w:p>
+      <w:pPr>
+        <w:pStyle w:val="Heading1"/>
+      </w:pPr>
+      <w:r>
+        <w:t>Opis i anaiza korištenog skupa podataka</w:t>
+      </w:r>
+    </w:p>
+    <w:p>
+      <w:pPr>
+        <w:pStyle w:val="BodyText"/>
+        <w:rPr>
+          <w:lang w:val="hr-HR"/>
+        </w:rPr>
+      </w:pPr>
+      <w:r>
+        <w:rPr>
+          <w:lang w:val="hr-HR"/>
+        </w:rPr>
+        <w:t>Prije</w:t>
+      </w:r>
+      <w:r>
+        <w:rPr>
+          <w:lang w:val="hr-HR"/>
+        </w:rPr>
+        <w:t xml:space="preserve"> implementacije</w:t>
+      </w:r>
+      <w:r>
+        <w:rPr>
+          <w:lang w:val="hr-HR"/>
+        </w:rPr>
+        <w:t xml:space="preserve"> model</w:t>
+      </w:r>
+      <w:r>
+        <w:rPr>
+          <w:lang w:val="hr-HR"/>
+        </w:rPr>
+        <w:t>a</w:t>
+      </w:r>
+      <w:r>
+        <w:rPr>
+          <w:lang w:val="hr-HR"/>
+        </w:rPr>
+        <w:t xml:space="preserve"> strojnog učenja koji ćemo koristiti za </w:t>
+      </w:r>
+      <w:r>
+        <w:rPr>
+          <w:lang w:val="hr-HR"/>
+        </w:rPr>
+        <w:t xml:space="preserve">klasifikaciju rendgenskih slika, potrebno je </w:t>
+      </w:r>
+      <w:r>
+        <w:rPr>
+          <w:lang w:val="hr-HR"/>
+        </w:rPr>
+        <w:t>odabrati podatkovni skup koji će se koristiti za treniranje i testiranje modela. Odlučili smo se za javno dostupan skup podataka koji je dostupan na stranici Kaggle</w:t>
+      </w:r>
+      <w:r>
+        <w:rPr>
+          <w:lang w:val="hr-HR"/>
+        </w:rPr>
         <w:t xml:space="preserve"> </w:t>
       </w:r>
-      <w:proofErr w:type="spellStart"/>
-      <w:r>
-        <w:t>karakteristika</w:t>
-      </w:r>
-      <w:proofErr w:type="spellEnd"/>
-      <w:r>
-        <w:t xml:space="preserve"> </w:t>
-      </w:r>
-      <w:proofErr w:type="spellStart"/>
-      <w:r>
-        <w:t>malignih</w:t>
-      </w:r>
-      <w:proofErr w:type="spellEnd"/>
-      <w:r>
-        <w:t xml:space="preserve"> </w:t>
-      </w:r>
-      <w:proofErr w:type="spellStart"/>
-      <w:r>
-        <w:t>i</w:t>
-      </w:r>
-      <w:proofErr w:type="spellEnd"/>
-      <w:r>
-        <w:t xml:space="preserve"> </w:t>
-      </w:r>
-      <w:proofErr w:type="spellStart"/>
-      <w:r>
-        <w:t>benignih</w:t>
-      </w:r>
-      <w:proofErr w:type="spellEnd"/>
-      <w:r>
-        <w:t xml:space="preserve"> </w:t>
-      </w:r>
-      <w:proofErr w:type="spellStart"/>
-      <w:r>
-        <w:t>tumora</w:t>
-      </w:r>
-      <w:proofErr w:type="spellEnd"/>
-      <w:r>
-        <w:t xml:space="preserve"> </w:t>
-      </w:r>
-      <w:proofErr w:type="spellStart"/>
-      <w:r>
-        <w:t>prema</w:t>
-      </w:r>
-      <w:proofErr w:type="spellEnd"/>
-      <w:r>
-        <w:t xml:space="preserve"> </w:t>
-      </w:r>
-      <w:proofErr w:type="spellStart"/>
-      <w:r>
-        <w:t>karakteristikama</w:t>
-      </w:r>
-      <w:proofErr w:type="spellEnd"/>
-      <w:r>
-        <w:t xml:space="preserve"> </w:t>
-      </w:r>
-      <w:proofErr w:type="spellStart"/>
-      <w:r>
-        <w:t>vidljivim</w:t>
-      </w:r>
-      <w:proofErr w:type="spellEnd"/>
-      <w:r>
-        <w:t xml:space="preserve"> </w:t>
-      </w:r>
-      <w:proofErr w:type="spellStart"/>
-      <w:r>
-        <w:t>na</w:t>
-      </w:r>
-      <w:proofErr w:type="spellEnd"/>
-      <w:r>
-        <w:t xml:space="preserve"> </w:t>
-      </w:r>
-      <w:proofErr w:type="spellStart"/>
-      <w:r>
-        <w:t>slikama</w:t>
-      </w:r>
-      <w:proofErr w:type="spellEnd"/>
-      <w:r>
-        <w:t xml:space="preserve"> </w:t>
-      </w:r>
-      <w:proofErr w:type="spellStart"/>
-      <w:r>
-        <w:t>ultrazvuka</w:t>
-      </w:r>
-      <w:proofErr w:type="spellEnd"/>
-      <w:r>
-        <w:t xml:space="preserve"> [4]</w:t>
-      </w:r>
-    </w:p>
-    <w:p>
-      <w:pPr>
-        <w:pStyle w:val="Heading1"/>
-        <w:numPr>
-          <w:ilvl w:val="0"/>
-          <w:numId w:val="0"/>
-        </w:numPr>
-        <w:jc w:val="both"/>
-      </w:pPr>
-      <w:r>
-        <w:t>Ease of Use</w:t>
-      </w:r>
-    </w:p>
-    <w:p>
-      <w:pPr>
-        <w:pStyle w:val="Heading2"/>
-      </w:pPr>
-      <w:r>
-        <w:t xml:space="preserve">Selecting a </w:t>
-      </w:r>
-      <w:r>
-        <w:t>Template</w:t>
-      </w:r>
-      <w:r>
-        <w:t xml:space="preserve"> (Heading 2)</w:t>
-      </w:r>
-    </w:p>
-    <w:p>
-      <w:pPr>
-        <w:pStyle w:val="BodyText"/>
-      </w:pPr>
-      <w:r>
-        <w:t xml:space="preserve">First, confirm that you have the correct template for your paper size. This template has been tailored for output on the </w:t>
-      </w:r>
-      <w:r>
-        <w:rPr>
-          <w:lang w:val="en-US"/>
-        </w:rPr>
-        <w:t>A4</w:t>
-      </w:r>
-      <w:r>
-        <w:t xml:space="preserve"> paper size. If you are using </w:t>
-      </w:r>
-      <w:r>
-        <w:rPr>
-          <w:lang w:val="en-US"/>
-        </w:rPr>
-        <w:t>US letter</w:t>
-      </w:r>
-      <w:r>
-        <w:t>-sized paper, please close this</w:t>
-      </w:r>
-      <w:r>
-        <w:t xml:space="preserve"> file and download the </w:t>
-      </w:r>
-      <w:r>
-        <w:rPr>
-          <w:lang w:val="en-US"/>
-        </w:rPr>
-        <w:t xml:space="preserve">Microsoft Word, Letter </w:t>
-      </w:r>
-      <w:r>
-        <w:t>file</w:t>
-      </w:r>
-      <w:r>
-        <w:t>.</w:t>
-      </w:r>
-    </w:p>
-    <w:p>
-      <w:pPr>
-        <w:pStyle w:val="Heading2"/>
-      </w:pPr>
-      <w:r>
-        <w:t>Maintaining the Integrity of the Specifications</w:t>
-      </w:r>
-    </w:p>
-    <w:p>
-      <w:pPr>
-        <w:pStyle w:val="BodyText"/>
-      </w:pPr>
-      <w:r>
-        <w:t>The template is used to format your paper and style the text. All margins, column widths, line spaces, and text fonts are prescribed; please do not alter them. You may note peculiarities. For example, the head margin in this template measures proportionately more than is customary. This measurement and others are deliberate, using specifications that anticipate your paper as one part of the entire proceedings, and not as an independent document. Please do not revise any of the current designations.</w:t>
-      </w:r>
-    </w:p>
-    <w:p>
-      <w:pPr>
-        <w:pStyle w:val="Heading1"/>
-      </w:pPr>
-      <w:r>
-        <w:t xml:space="preserve">Prepare Your Paper </w:t>
-      </w:r>
-      <w:r>
-        <w:t>Before</w:t>
-      </w:r>
-      <w:r>
-        <w:t xml:space="preserve"> Styling</w:t>
-      </w:r>
-    </w:p>
-    <w:p>
-      <w:pPr>
-        <w:pStyle w:val="BodyText"/>
-        <w:rPr>
-          <w:lang w:val="en-US"/>
-        </w:rPr>
-      </w:pPr>
-      <w:r>
-        <w:t>Before</w:t>
-      </w:r>
-      <w:r>
-        <w:t xml:space="preserve"> you begin to format your paper, first write and save the content as a separate text file. </w:t>
-      </w:r>
-      <w:r>
-        <w:rPr>
-          <w:lang w:val="en-US"/>
-        </w:rPr>
-        <w:t>Complete all content and organizational editing before formatting. Please note sections A-D below for more information on proofreading, spelling and grammar.</w:t>
-      </w:r>
-    </w:p>
-    <w:p>
-      <w:pPr>
-        <w:pStyle w:val="BodyText"/>
-      </w:pPr>
-      <w:r>
-        <w:t xml:space="preserve">Keep your text and graphic files separate until after the text has been formatted and styled. Do not use hard tabs, and limit use of hard returns to only one return at the end of a paragraph. </w:t>
-      </w:r>
-      <w:r>
-        <w:lastRenderedPageBreak/>
-        <w:t>Do not add any kind of pagination anywhere in the paper. Do not number text heads-the template will do that for you.</w:t>
-      </w:r>
-    </w:p>
-    <w:p>
-      <w:pPr>
-        <w:pStyle w:val="Heading2"/>
-      </w:pPr>
-      <w:r>
-        <w:t>Abbreviations</w:t>
-      </w:r>
-      <w:r>
-        <w:t xml:space="preserve"> and Acronyms</w:t>
-      </w:r>
-    </w:p>
-    <w:p>
-      <w:pPr>
-        <w:pStyle w:val="BodyText"/>
-      </w:pPr>
-      <w:r>
-        <w:t xml:space="preserve">Define abbreviations and acronyms the first time they are used in the text, even after they have been defined in the abstract. Abbreviations such as IEEE, SI, MKS, CGS, </w:t>
-      </w:r>
-      <w:proofErr w:type="spellStart"/>
-      <w:r>
-        <w:t>sc</w:t>
-      </w:r>
-      <w:proofErr w:type="spellEnd"/>
-      <w:r>
-        <w:t>, dc, and rms do not have to be defined. Do not use abbreviations in the title or heads unless they are unavoidable.</w:t>
-      </w:r>
-    </w:p>
-    <w:p>
-      <w:pPr>
-        <w:pStyle w:val="Heading2"/>
-      </w:pPr>
-      <w:r>
-        <w:t>Units</w:t>
-      </w:r>
-    </w:p>
-    <w:p>
-      <w:pPr>
-        <w:pStyle w:val="bulletlist"/>
-      </w:pPr>
-      <w:r>
-        <w:t xml:space="preserve">Use </w:t>
-      </w:r>
-      <w:r>
-        <w:t>either</w:t>
-      </w:r>
-      <w:r>
-        <w:t xml:space="preserve"> SI (MKS) or CGS as primary units. (SI units are encouraged.) English units may be used as secondary units (in parentheses). An exception would be the use of English units as identifiers in trade, such as “3.5-inch disk drive”.</w:t>
-      </w:r>
-    </w:p>
-    <w:p>
-      <w:pPr>
-        <w:pStyle w:val="bulletlist"/>
-      </w:pPr>
-      <w:r>
-        <w:t xml:space="preserve">Avoid combining SI and CGS units, such as current in amperes and magnetic field in </w:t>
-      </w:r>
-      <w:proofErr w:type="spellStart"/>
-      <w:r>
-        <w:t>oersteds</w:t>
-      </w:r>
-      <w:proofErr w:type="spellEnd"/>
-      <w:r>
-        <w:t>. This often leads to confusion because equations do not balance dimensionally. If you must use mixed units, clearly state the units for each quantity that you use in an equation.</w:t>
-      </w:r>
-    </w:p>
-    <w:p>
-      <w:pPr>
-        <w:pStyle w:val="bulletlist"/>
-      </w:pPr>
-      <w:r>
-        <w:t>Do not mix complete spellings and abbreviations of units: “Wb/m2” or “</w:t>
-      </w:r>
-      <w:proofErr w:type="spellStart"/>
-      <w:r>
-        <w:t>webers</w:t>
-      </w:r>
-      <w:proofErr w:type="spellEnd"/>
-      <w:r>
-        <w:t xml:space="preserve"> per square meter”, not “</w:t>
-      </w:r>
-      <w:proofErr w:type="spellStart"/>
-      <w:r>
-        <w:t>webers</w:t>
-      </w:r>
-      <w:proofErr w:type="spellEnd"/>
-      <w:r>
-        <w:t xml:space="preserve">/m2”.  Spell out units when they appear in text: “. . . a few </w:t>
-      </w:r>
-      <w:proofErr w:type="spellStart"/>
-      <w:r>
-        <w:t>henries</w:t>
-      </w:r>
-      <w:proofErr w:type="spellEnd"/>
-      <w:r>
-        <w:t>”, not “. . . a few H”.</w:t>
-      </w:r>
-    </w:p>
-    <w:p>
-      <w:pPr>
-        <w:pStyle w:val="sponsors"/>
-        <w:framePr w:wrap="auto" w:vAnchor="page" w:hAnchor="page" w:x="45.90pt" w:y="756.05pt"/>
-        <w:ind w:firstLine="14.45pt"/>
-      </w:pPr>
-      <w:r>
-        <w:t>Identif</w:t>
-      </w:r>
-      <w:r>
-        <w:t xml:space="preserve">y applicable </w:t>
-      </w:r>
-      <w:r>
-        <w:t>funding agency</w:t>
-      </w:r>
-      <w:r>
-        <w:t xml:space="preserve"> here. </w:t>
-      </w:r>
-      <w:r>
-        <w:rPr>
-          <w:iCs/>
-        </w:rPr>
-        <w:t>If none, delete this text box</w:t>
-      </w:r>
-      <w:r>
-        <w:rPr>
-          <w:iCs/>
-        </w:rPr>
-        <w:t>.</w:t>
-      </w:r>
-    </w:p>
-    <w:p>
-      <w:pPr>
-        <w:pStyle w:val="bulletlist"/>
-      </w:pPr>
-      <w:r>
-        <w:t xml:space="preserve">Use a zero before decimal points: “0.25”, not “.25”. Use “cm3”, not “cc”. </w:t>
-      </w:r>
-      <w:r>
-        <w:t>(</w:t>
+      <w:r>
+        <w:rPr>
+          <w:lang w:val="hr-HR"/>
+        </w:rPr>
+        <w:t>[5], a sadrži preko 10 000 rendgenskih slika s mamografije</w:t>
+      </w:r>
+      <w:r>
+        <w:rPr>
+          <w:lang w:val="hr-HR"/>
+        </w:rPr>
+        <w:t>. U skupu je 1566 pacijenata. Za svakog pacijenta može postojati nekoliko slika s mamografije iz različitih pozicija, a u skupu podataka se također nalaze izrezane slike manjih dimenzija koje fokusiraju određen dio rendgenske slike (</w:t>
       </w:r>
       <w:r>
         <w:rPr>
           <w:i/>
           <w:iCs/>
-        </w:rPr>
-        <w:t>bullet list</w:t>
-      </w:r>
-      <w:r>
-        <w:t>)</w:t>
-      </w:r>
+          <w:lang w:val="hr-HR"/>
+        </w:rPr>
+        <w:t>cropped images</w:t>
+      </w:r>
+      <w:r>
+        <w:rPr>
+          <w:lang w:val="hr-HR"/>
+        </w:rPr>
+        <w:t>) koji možda sadrži oblik raka te ROI (</w:t>
+      </w:r>
+      <w:r>
+        <w:rPr>
+          <w:i/>
+          <w:iCs/>
+          <w:lang w:val="hr-HR"/>
+        </w:rPr>
+        <w:t>region of interest</w:t>
+      </w:r>
+      <w:r>
+        <w:rPr>
+          <w:lang w:val="hr-HR"/>
+        </w:rPr>
+        <w:t>) masku koja označava iz kojeg je dijela originalne slike napravljena izrezana slika.</w:t>
+      </w:r>
+    </w:p>
+    <w:p>
+      <w:pPr>
+        <w:pStyle w:val="BodyText"/>
+        <w:rPr>
+          <w:lang w:val="hr-HR"/>
+        </w:rPr>
+      </w:pPr>
+      <w:r>
+        <w:rPr>
+          <w:lang w:val="hr-HR"/>
+        </w:rPr>
+        <w:t>Originalni skup podataka je bio podijeljen u 2 direktorija, „csv“</w:t>
+      </w:r>
+      <w:r>
+        <w:rPr>
+          <w:i/>
+          <w:iCs/>
+          <w:lang w:val="hr-HR"/>
+        </w:rPr>
+        <w:t xml:space="preserve"> </w:t>
+      </w:r>
+      <w:r>
+        <w:rPr>
+          <w:lang w:val="hr-HR"/>
+        </w:rPr>
+        <w:t xml:space="preserve">i „jpeg“. U „csv“ direktoriju se nalazi nekoliko .csv datoteka koje sadrže informacije kao što su ID pacijenta, </w:t>
+      </w:r>
+      <w:r>
+        <w:rPr>
+          <w:lang w:val="hr-HR"/>
+        </w:rPr>
+        <w:lastRenderedPageBreak/>
+        <w:t>gustoća dojke, radi li se o lijevoj ili desnoj dojci, perspektiva</w:t>
+      </w:r>
+      <w:r>
+        <w:rPr>
+          <w:noProof/>
+        </w:rPr>
+        <w:drawing>
+          <wp:anchor distT="0" distB="0" distL="114300" distR="114300" simplePos="0" relativeHeight="251659776" behindDoc="0" locked="0" layoutInCell="1" allowOverlap="1" wp14:anchorId="736B4D69" wp14:editId="1EDDA1A3">
+            <wp:simplePos x="0" y="0"/>
+            <wp:positionH relativeFrom="column">
+              <wp:posOffset>3213100</wp:posOffset>
+            </wp:positionH>
+            <wp:positionV relativeFrom="paragraph">
+              <wp:posOffset>0</wp:posOffset>
+            </wp:positionV>
+            <wp:extent cx="3272790" cy="2063750"/>
+            <wp:effectExtent l="0" t="0" r="3810" b="0"/>
+            <wp:wrapTopAndBottom/>
+            <wp:docPr id="562555958" name="Picture 1" descr="A graph with red and blue dots&#10;&#10;Description automatically generated"/>
+            <wp:cNvGraphicFramePr>
+              <a:graphicFrameLocks xmlns:a="http://purl.oclc.org/ooxml/drawingml/main" noChangeAspect="1"/>
+            </wp:cNvGraphicFramePr>
+            <a:graphic xmlns:a="http://purl.oclc.org/ooxml/drawingml/main">
+              <a:graphicData uri="http://purl.oclc.org/ooxml/drawingml/picture">
+                <pic:pic xmlns:pic="http://purl.oclc.org/ooxml/drawingml/picture">
+                  <pic:nvPicPr>
+                    <pic:cNvPr id="562555958" name="Picture 1" descr="A graph with red and blue dots&#10;&#10;Description automatically generated"/>
+                    <pic:cNvPicPr/>
+                  </pic:nvPicPr>
+                  <pic:blipFill>
+                    <a:blip r:embed="rId10" cstate="print">
+                      <a:extLst>
+                        <a:ext uri="{28A0092B-C50C-407E-A947-70E740481C1C}">
+                          <a14:useLocalDpi xmlns:a14="http://schemas.microsoft.com/office/drawing/2010/main" val="0"/>
+                        </a:ext>
+                      </a:extLst>
+                    </a:blip>
+                    <a:stretch>
+                      <a:fillRect/>
+                    </a:stretch>
+                  </pic:blipFill>
+                  <pic:spPr>
+                    <a:xfrm>
+                      <a:off x="0" y="0"/>
+                      <a:ext cx="3272790" cy="2063750"/>
+                    </a:xfrm>
+                    <a:prstGeom prst="rect">
+                      <a:avLst/>
+                    </a:prstGeom>
+                  </pic:spPr>
+                </pic:pic>
+              </a:graphicData>
+            </a:graphic>
+            <wp14:sizeRelH relativeFrom="margin">
+              <wp14:pctWidth>0%</wp14:pctWidth>
+            </wp14:sizeRelH>
+            <wp14:sizeRelV relativeFrom="margin">
+              <wp14:pctHeight>0%</wp14:pctHeight>
+            </wp14:sizeRelV>
+          </wp:anchor>
+        </w:drawing>
+      </w:r>
+      <w:r>
+        <w:rPr>
+          <w:lang w:val="hr-HR"/>
+        </w:rPr>
+        <w:t xml:space="preserve"> s</w:t>
+      </w:r>
+      <w:r>
+        <w:rPr>
+          <w:lang w:val="hr-HR"/>
+        </w:rPr>
+        <w:t>like (</w:t>
+      </w:r>
+      <w:r>
+        <w:rPr>
+          <w:lang w:val="en-US"/>
+        </w:rPr>
+        <w:t>k</w:t>
+      </w:r>
+      <w:r>
+        <w:rPr>
+          <w:lang w:val="en-US"/>
+        </w:rPr>
+        <w:t>raniokaudalna</w:t>
+      </w:r>
+      <w:r>
+        <w:rPr>
+          <w:lang w:val="en-US"/>
+        </w:rPr>
+        <w:t xml:space="preserve"> ili m</w:t>
+      </w:r>
+      <w:r>
+        <w:rPr>
+          <w:lang w:val="en-US"/>
+        </w:rPr>
+        <w:t>edijalno-lateralna kosa projekcija</w:t>
+      </w:r>
+      <w:r>
+        <w:rPr>
+          <w:lang w:val="hr-HR"/>
+        </w:rPr>
+        <w:t xml:space="preserve">) i nama najbitniji podatak; patologija. Ta nam kategorija, odnosno stupac govori je li na specifičnoj slici prisutno </w:t>
+      </w:r>
+      <w:r>
+        <w:rPr>
+          <w:b/>
+          <w:bCs/>
+          <w:lang w:val="hr-HR"/>
+        </w:rPr>
+        <w:t>maligno</w:t>
+      </w:r>
+      <w:r>
+        <w:rPr>
+          <w:lang w:val="hr-HR"/>
+        </w:rPr>
+        <w:t xml:space="preserve"> (kancerogeno) tkivo, </w:t>
+      </w:r>
+      <w:r>
+        <w:rPr>
+          <w:b/>
+          <w:bCs/>
+          <w:lang w:val="hr-HR"/>
+        </w:rPr>
+        <w:t>benigno</w:t>
+      </w:r>
+      <w:r>
+        <w:rPr>
+          <w:lang w:val="hr-HR"/>
+        </w:rPr>
+        <w:t xml:space="preserve"> tkivo </w:t>
+      </w:r>
+      <w:r>
+        <w:rPr>
+          <w:lang w:val="hr-HR"/>
+        </w:rPr>
+        <w:t>koje nije kancerogeno i raste normalnom brzinom, ali bi bila poželjna češća kontrola</w:t>
+      </w:r>
+      <w:r>
+        <w:rPr>
+          <w:lang w:val="hr-HR"/>
+        </w:rPr>
+        <w:t xml:space="preserve"> ili </w:t>
+      </w:r>
+      <w:r>
+        <w:rPr>
+          <w:b/>
+          <w:bCs/>
+          <w:lang w:val="hr-HR"/>
+        </w:rPr>
+        <w:t>benigno tkivo za koje nisu potrebni daljnji učestali pregledi</w:t>
+      </w:r>
+      <w:r>
+        <w:rPr>
+          <w:lang w:val="hr-HR"/>
+        </w:rPr>
+        <w:t xml:space="preserve">. Ove su tri kategorije u podacima označene kao MALIGNANT, BENIGN i </w:t>
+      </w:r>
+      <w:r>
+        <w:rPr>
+          <w:lang w:val="hr-HR"/>
+        </w:rPr>
+        <w:t>BENIGN_WITHOUT_CALLBACK</w:t>
+      </w:r>
+      <w:r>
+        <w:rPr>
+          <w:lang w:val="hr-HR"/>
+        </w:rPr>
+        <w:t xml:space="preserve">. U „jpeg“ direktoriju nalazilo se 6774 direktorija od kojih su neki sadržavali originalnu sliku rendgenske snimke s mamografije koja je velikih dimenzija, a neki direktoriji su sadržavali po dvije slike od kojih je jedna bila izrezani manji dio originalne slike, a druga ROI maska koja prikazuje fokusirano područje originalne slike. Jedna originalna rendgenska slika može biti povezana s više </w:t>
+      </w:r>
+      <w:r>
+        <w:rPr>
+          <w:lang w:val="hr-HR"/>
+        </w:rPr>
+        <w:t>izrezanih slika i ROI maski</w:t>
+      </w:r>
+      <w:r>
+        <w:rPr>
+          <w:lang w:val="hr-HR"/>
+        </w:rPr>
+        <w:t xml:space="preserve"> što se da zaključiti analizom .csv datoteka. To ima smisla jer neke dojke mogu imati više područja za koja se sumnja da sadrže maligno tkivo.</w:t>
+      </w:r>
+    </w:p>
+    <w:p>
+      <w:pPr>
+        <w:pStyle w:val="BodyText"/>
+        <w:rPr>
+          <w:noProof/>
+        </w:rPr>
+      </w:pPr>
+      <w:r>
+        <w:rPr>
+          <w:noProof/>
+          <w:lang w:val="hr-HR"/>
+        </w:rPr>
+        <w:drawing>
+          <wp:anchor distT="0" distB="0" distL="114300" distR="114300" simplePos="0" relativeHeight="251660800" behindDoc="0" locked="0" layoutInCell="1" allowOverlap="1" wp14:anchorId="49758A6F" wp14:editId="610BDB01">
+            <wp:simplePos x="0" y="0"/>
+            <wp:positionH relativeFrom="column">
+              <wp:posOffset>3538855</wp:posOffset>
+            </wp:positionH>
+            <wp:positionV relativeFrom="paragraph">
+              <wp:posOffset>1646555</wp:posOffset>
+            </wp:positionV>
+            <wp:extent cx="2604135" cy="1943100"/>
+            <wp:effectExtent l="0" t="0" r="5715" b="0"/>
+            <wp:wrapTopAndBottom/>
+            <wp:docPr id="1249814953" name="Picture 1" descr="A graph of blue rectangular objects&#10;&#10;Description automatically generated with medium confidence"/>
+            <wp:cNvGraphicFramePr>
+              <a:graphicFrameLocks xmlns:a="http://purl.oclc.org/ooxml/drawingml/main" noChangeAspect="1"/>
+            </wp:cNvGraphicFramePr>
+            <a:graphic xmlns:a="http://purl.oclc.org/ooxml/drawingml/main">
+              <a:graphicData uri="http://purl.oclc.org/ooxml/drawingml/picture">
+                <pic:pic xmlns:pic="http://purl.oclc.org/ooxml/drawingml/picture">
+                  <pic:nvPicPr>
+                    <pic:cNvPr id="1249814953" name="Picture 1" descr="A graph of blue rectangular objects&#10;&#10;Description automatically generated with medium confidence"/>
+                    <pic:cNvPicPr/>
+                  </pic:nvPicPr>
+                  <pic:blipFill>
+                    <a:blip r:embed="rId11" cstate="print">
+                      <a:extLst>
+                        <a:ext uri="{28A0092B-C50C-407E-A947-70E740481C1C}">
+                          <a14:useLocalDpi xmlns:a14="http://schemas.microsoft.com/office/drawing/2010/main" val="0"/>
+                        </a:ext>
+                      </a:extLst>
+                    </a:blip>
+                    <a:stretch>
+                      <a:fillRect/>
+                    </a:stretch>
+                  </pic:blipFill>
+                  <pic:spPr>
+                    <a:xfrm>
+                      <a:off x="0" y="0"/>
+                      <a:ext cx="2604135" cy="1943100"/>
+                    </a:xfrm>
+                    <a:prstGeom prst="rect">
+                      <a:avLst/>
+                    </a:prstGeom>
+                  </pic:spPr>
+                </pic:pic>
+              </a:graphicData>
+            </a:graphic>
+            <wp14:sizeRelH relativeFrom="margin">
+              <wp14:pctWidth>0%</wp14:pctWidth>
+            </wp14:sizeRelH>
+            <wp14:sizeRelV relativeFrom="margin">
+              <wp14:pctHeight>0%</wp14:pctHeight>
+            </wp14:sizeRelV>
+          </wp:anchor>
+        </w:drawing>
+      </w:r>
+      <w:r>
+        <w:rPr>
+          <w:noProof/>
+          <w:lang w:val="hr-HR"/>
+        </w:rPr>
+        <w:drawing>
+          <wp:anchor distT="0" distB="0" distL="114300" distR="114300" simplePos="0" relativeHeight="251658752" behindDoc="0" locked="0" layoutInCell="1" allowOverlap="1" wp14:anchorId="00A0AC88" wp14:editId="08207A98">
+            <wp:simplePos x="0" y="0"/>
+            <wp:positionH relativeFrom="column">
+              <wp:align>right</wp:align>
+            </wp:positionH>
+            <wp:positionV relativeFrom="paragraph">
+              <wp:posOffset>3769451</wp:posOffset>
+            </wp:positionV>
+            <wp:extent cx="3244850" cy="2037080"/>
+            <wp:effectExtent l="0" t="0" r="0" b="1270"/>
+            <wp:wrapTopAndBottom/>
+            <wp:docPr id="1028080298" name="Picture 1" descr="A graph showing red and blue dots&#10;&#10;Description automatically generated"/>
+            <wp:cNvGraphicFramePr>
+              <a:graphicFrameLocks xmlns:a="http://purl.oclc.org/ooxml/drawingml/main" noChangeAspect="1"/>
+            </wp:cNvGraphicFramePr>
+            <a:graphic xmlns:a="http://purl.oclc.org/ooxml/drawingml/main">
+              <a:graphicData uri="http://purl.oclc.org/ooxml/drawingml/picture">
+                <pic:pic xmlns:pic="http://purl.oclc.org/ooxml/drawingml/picture">
+                  <pic:nvPicPr>
+                    <pic:cNvPr id="1028080298" name="Picture 1" descr="A graph showing red and blue dots&#10;&#10;Description automatically generated"/>
+                    <pic:cNvPicPr/>
+                  </pic:nvPicPr>
+                  <pic:blipFill>
+                    <a:blip r:embed="rId12" cstate="print">
+                      <a:extLst>
+                        <a:ext uri="{28A0092B-C50C-407E-A947-70E740481C1C}">
+                          <a14:useLocalDpi xmlns:a14="http://schemas.microsoft.com/office/drawing/2010/main" val="0"/>
+                        </a:ext>
+                      </a:extLst>
+                    </a:blip>
+                    <a:stretch>
+                      <a:fillRect/>
+                    </a:stretch>
+                  </pic:blipFill>
+                  <pic:spPr>
+                    <a:xfrm>
+                      <a:off x="0" y="0"/>
+                      <a:ext cx="3244850" cy="2037080"/>
+                    </a:xfrm>
+                    <a:prstGeom prst="rect">
+                      <a:avLst/>
+                    </a:prstGeom>
+                  </pic:spPr>
+                </pic:pic>
+              </a:graphicData>
+            </a:graphic>
+            <wp14:sizeRelH relativeFrom="margin">
+              <wp14:pctWidth>0%</wp14:pctWidth>
+            </wp14:sizeRelH>
+            <wp14:sizeRelV relativeFrom="margin">
+              <wp14:pctHeight>0%</wp14:pctHeight>
+            </wp14:sizeRelV>
+          </wp:anchor>
+        </w:drawing>
+      </w:r>
+      <w:r>
+        <w:rPr>
+          <w:lang w:val="hr-HR"/>
+        </w:rPr>
+        <w:t xml:space="preserve">Nakon upoznavanja s podatkovnim skupom, </w:t>
+      </w:r>
+      <w:r>
+        <w:rPr>
+          <w:lang w:val="hr-HR"/>
+        </w:rPr>
+        <w:t xml:space="preserve">uslijedila je obrada i priprema skupa za model strojnog učenja. Odlučili smo </w:t>
+      </w:r>
+      <w:r>
+        <w:rPr>
+          <w:lang w:val="hr-HR"/>
+        </w:rPr>
+        <w:t>koristiti isključivo izrezane slike manjih dimenzija za model jer su na njima već izdvojena područja interesa i manjih su dimenzija, odnosno veličine što će znatno ubrzati učenje i olakšati izradu modela. Kada bismo koristili originalne rendgenske slike cijeli skup podataka bi imao preko 11 GB, a ovako je sveden na nešto više od 200 MB. ROI maske nam također nisu od interesa jer ne sadrže nikakvu korisnu informaciju o tome je li prikazano tkivo maligno, već samo imaju bijelu točku koja je okružena crnom pozadinom te predstavlja s kojeg je dijela originalne slike uzeta izrezana slika. Budući da se ROI maske i izrezane slike nalaze u istim direktorijima, bilo je potrebno pronaći način za automatizirano razlikovanje i preuzimanje samo izrezanih slika iz više od 3000 direktorija. U imenima .jpg datoteka nije specificirano radi li se o ROI maski ili izrezanoj slici</w:t>
+      </w:r>
+      <w:r>
+        <w:rPr>
+          <w:lang w:val="hr-HR"/>
+        </w:rPr>
+        <w:t>, ponekad ROI maska ima naziv „1“, dok izrezana slika ima naziv datoteke „2“, a ponekad je obrnuta situacija</w:t>
+      </w:r>
+      <w:r>
+        <w:rPr>
+          <w:lang w:val="hr-HR"/>
+        </w:rPr>
+        <w:t>. Također u .csv datotekama isto nije specificirano koja je od dvije datoteke u direktoriju ROI maska, a koja izrezana slika.</w:t>
+      </w:r>
+      <w:r>
+        <w:rPr>
+          <w:lang w:val="hr-HR"/>
+        </w:rPr>
+        <w:t xml:space="preserve"> Uočili smo da je u direktorijima koji sadrže masku i izrezanu sliku maska uvijek znatno većih dimenzija, pa smo odlučili napraviti automatiziranu ekstrakciju izrezanih slika na temelju dimenzija tih slika. Na Slikama 2. i 3. vidljivi su grafički prikazi dimenzija ROI maski i izrezanih slika za testni skup i skup za treniranje.</w:t>
+      </w:r>
+      <w:r>
+        <w:rPr>
+          <w:noProof/>
+        </w:rPr>
+        <w:t xml:space="preserve"> </w:t>
+      </w:r>
+    </w:p>
+    <w:p>
+      <w:pPr>
+        <w:pStyle w:val="Caption"/>
+        <w:rPr>
+          <w:lang w:val="hr-HR"/>
+        </w:rPr>
+      </w:pPr>
+      <w:r>
+        <w:rPr>
+          <w:lang w:val="hr-HR"/>
+        </w:rPr>
+        <w:t>Slika 2. Usporedba dimenzija ROI maski i izrezanih slika u skupu za testiranje</w:t>
+      </w:r>
+    </w:p>
+    <w:p>
+      <w:pPr>
+        <w:pStyle w:val="Caption"/>
+        <w:rPr>
+          <w:lang w:val="hr-HR"/>
+        </w:rPr>
+      </w:pPr>
+      <w:r>
+        <w:rPr>
+          <w:lang w:val="hr-HR"/>
+        </w:rPr>
+        <w:t xml:space="preserve">Slika 3. Usporedba dimenzija ROI maski i izrezanih slika u skupu za </w:t>
+      </w:r>
+      <w:r>
+        <w:rPr>
+          <w:lang w:val="hr-HR"/>
+        </w:rPr>
+        <w:t>treniranje</w:t>
+      </w:r>
+    </w:p>
+    <w:p>
+      <w:pPr>
+        <w:jc w:val="start"/>
+        <w:rPr>
+          <w:spacing w:val="-1"/>
+          <w:lang w:val="hr-HR" w:eastAsia="x-none"/>
+        </w:rPr>
+      </w:pPr>
+      <w:r>
+        <w:rPr>
+          <w:spacing w:val="-1"/>
+          <w:lang w:val="hr-HR" w:eastAsia="x-none"/>
+        </w:rPr>
+        <w:t xml:space="preserve">Na skupu za testiranje, koji sadrži 326 različitih </w:t>
+      </w:r>
+      <w:r>
+        <w:rPr>
+          <w:spacing w:val="-1"/>
+          <w:lang w:val="hr-HR" w:eastAsia="x-none"/>
+        </w:rPr>
+        <w:t xml:space="preserve">izrezanih slika i ROI maski, vrlo je jasno vidljiva </w:t>
+      </w:r>
+      <w:r>
+        <w:rPr>
+          <w:spacing w:val="-1"/>
+          <w:lang w:val="hr-HR" w:eastAsia="x-none"/>
+        </w:rPr>
+        <w:t xml:space="preserve">razlika između izrezanih slika koje imaju manje dimenzije i ROI maski koje su znatno većih dimenzija. </w:t>
+      </w:r>
+      <w:r>
+        <w:rPr>
+          <w:spacing w:val="-1"/>
+          <w:lang w:val="hr-HR" w:eastAsia="x-none"/>
+        </w:rPr>
+        <w:t xml:space="preserve">Na skupu za treniranje koji ima po 1546 izrezanih slika i ROI maski, vidimo par </w:t>
+      </w:r>
+      <w:r>
+        <w:rPr>
+          <w:i/>
+          <w:iCs/>
+          <w:spacing w:val="-1"/>
+          <w:lang w:val="hr-HR" w:eastAsia="x-none"/>
+        </w:rPr>
+        <w:t xml:space="preserve">outliera, </w:t>
+      </w:r>
+      <w:r>
+        <w:rPr>
+          <w:spacing w:val="-1"/>
+          <w:lang w:val="hr-HR" w:eastAsia="x-none"/>
+        </w:rPr>
+        <w:t>odnosno izrezanih slika (označene plavim točkama na grafu) koje su nešto većih dimenzija, što je za očekivati s obzirom na puno veći podatkovni skup. Bitno je da su te velike izrezane slike i dalje veće površine od ROI maske s kojom su u direktoriju, jer je to uvjet po kojem odvajamo izrezane slike. Budući da je uvjet zadovoljen, uspješno smo izolirali izrezane slike koje ćemo koristiti za testiranje i treniranje modela.</w:t>
+      </w:r>
+    </w:p>
+    <w:p>
+      <w:pPr>
+        <w:pStyle w:val="Caption"/>
+        <w:rPr>
+          <w:lang w:val="hr-HR"/>
+        </w:rPr>
+      </w:pPr>
+      <w:r>
+        <w:rPr>
+          <w:noProof/>
+          <w:lang w:val="hr-HR"/>
+        </w:rPr>
+        <w:drawing>
+          <wp:anchor distT="0" distB="0" distL="114300" distR="114300" simplePos="0" relativeHeight="251661824" behindDoc="0" locked="0" layoutInCell="1" allowOverlap="1" wp14:anchorId="10400D5B" wp14:editId="1374EFCE">
+            <wp:simplePos x="0" y="0"/>
+            <wp:positionH relativeFrom="column">
+              <wp:posOffset>221615</wp:posOffset>
+            </wp:positionH>
+            <wp:positionV relativeFrom="paragraph">
+              <wp:posOffset>2230120</wp:posOffset>
+            </wp:positionV>
+            <wp:extent cx="2638425" cy="1936750"/>
+            <wp:effectExtent l="0" t="0" r="9525" b="6350"/>
+            <wp:wrapTopAndBottom/>
+            <wp:docPr id="1613937973" name="Picture 1" descr="A purple bar graph with white text&#10;&#10;Description automatically generated"/>
+            <wp:cNvGraphicFramePr>
+              <a:graphicFrameLocks xmlns:a="http://purl.oclc.org/ooxml/drawingml/main" noChangeAspect="1"/>
+            </wp:cNvGraphicFramePr>
+            <a:graphic xmlns:a="http://purl.oclc.org/ooxml/drawingml/main">
+              <a:graphicData uri="http://purl.oclc.org/ooxml/drawingml/picture">
+                <pic:pic xmlns:pic="http://purl.oclc.org/ooxml/drawingml/picture">
+                  <pic:nvPicPr>
+                    <pic:cNvPr id="1613937973" name="Picture 1" descr="A purple bar graph with white text&#10;&#10;Description automatically generated"/>
+                    <pic:cNvPicPr/>
+                  </pic:nvPicPr>
+                  <pic:blipFill>
+                    <a:blip r:embed="rId13" cstate="print">
+                      <a:extLst>
+                        <a:ext uri="{28A0092B-C50C-407E-A947-70E740481C1C}">
+                          <a14:useLocalDpi xmlns:a14="http://schemas.microsoft.com/office/drawing/2010/main" val="0"/>
+                        </a:ext>
+                      </a:extLst>
+                    </a:blip>
+                    <a:stretch>
+                      <a:fillRect/>
+                    </a:stretch>
+                  </pic:blipFill>
+                  <pic:spPr>
+                    <a:xfrm>
+                      <a:off x="0" y="0"/>
+                      <a:ext cx="2638425" cy="1936750"/>
+                    </a:xfrm>
+                    <a:prstGeom prst="rect">
+                      <a:avLst/>
+                    </a:prstGeom>
+                  </pic:spPr>
+                </pic:pic>
+              </a:graphicData>
+            </a:graphic>
+            <wp14:sizeRelH relativeFrom="margin">
+              <wp14:pctWidth>0%</wp14:pctWidth>
+            </wp14:sizeRelH>
+            <wp14:sizeRelV relativeFrom="margin">
+              <wp14:pctHeight>0%</wp14:pctHeight>
+            </wp14:sizeRelV>
+          </wp:anchor>
+        </w:drawing>
+      </w:r>
+      <w:r>
+        <w:rPr>
+          <w:lang w:val="hr-HR"/>
+        </w:rPr>
+        <w:t xml:space="preserve">Slika </w:t>
+      </w:r>
+      <w:r>
+        <w:rPr>
+          <w:lang w:val="hr-HR"/>
+        </w:rPr>
+        <w:t>4</w:t>
+      </w:r>
+      <w:r>
+        <w:rPr>
+          <w:lang w:val="hr-HR"/>
+        </w:rPr>
+        <w:t xml:space="preserve">. </w:t>
+      </w:r>
+      <w:r>
+        <w:rPr>
+          <w:lang w:val="hr-HR"/>
+        </w:rPr>
+        <w:t>Razdioba vrijednosti značajke Pathology na skupu za treniranje</w:t>
+      </w:r>
+    </w:p>
+    <w:p>
+      <w:pPr>
+        <w:pStyle w:val="Caption"/>
+        <w:rPr>
+          <w:lang w:val="hr-HR"/>
+        </w:rPr>
+      </w:pPr>
+      <w:r>
+        <w:rPr>
+          <w:lang w:val="hr-HR"/>
+        </w:rPr>
+        <w:t>S</w:t>
+      </w:r>
+      <w:r>
+        <w:rPr>
+          <w:lang w:val="hr-HR"/>
+        </w:rPr>
+        <w:t xml:space="preserve">lika </w:t>
+      </w:r>
+      <w:r>
+        <w:rPr>
+          <w:lang w:val="hr-HR"/>
+        </w:rPr>
+        <w:t>5</w:t>
+      </w:r>
+      <w:r>
+        <w:rPr>
+          <w:lang w:val="hr-HR"/>
+        </w:rPr>
+        <w:t xml:space="preserve">. </w:t>
+      </w:r>
+      <w:r>
+        <w:rPr>
+          <w:lang w:val="hr-HR"/>
+        </w:rPr>
+        <w:t>Razdioba vrijednosti značajke Pathology na testnom skupu</w:t>
+      </w:r>
+    </w:p>
+    <w:p>
+      <w:pPr>
+        <w:jc w:val="start"/>
+        <w:rPr>
+          <w:lang w:val="hr-HR"/>
+        </w:rPr>
+      </w:pPr>
+      <w:r>
+        <w:rPr>
+          <w:lang w:val="hr-HR"/>
+        </w:rPr>
+        <w:br w:type="page"/>
+      </w:r>
+    </w:p>
+    <w:p>
+      <w:pPr>
+        <w:jc w:val="start"/>
+        <w:rPr>
+          <w:lang w:val="hr-HR"/>
+        </w:rPr>
+      </w:pPr>
+      <w:r>
+        <w:rPr>
+          <w:lang w:val="hr-HR"/>
+        </w:rPr>
+        <w:lastRenderedPageBreak/>
+        <w:t>Sa Slike 4. je vidljivo da je frekvencija mogućih vrijednosti stručnih dijagnoza (</w:t>
+      </w:r>
+      <w:r>
+        <w:rPr>
+          <w:i/>
+          <w:iCs/>
+          <w:lang w:val="hr-HR"/>
+        </w:rPr>
+        <w:t>Pahtology</w:t>
+      </w:r>
+      <w:r>
+        <w:rPr>
+          <w:lang w:val="hr-HR"/>
+        </w:rPr>
+        <w:t xml:space="preserve">) za tkiva prikazana na izrezanim slikama podjednaka za sve tri vrijednosti na skupu za treniranje. Slika 5. prikazuje da situacija nije ista na skupu za testiranje gdje je ipak broj slika s oznakom BENIGN_WITHOUT_CALLBACK skoro duplo manji od broja oznaka BENIGN i MALIGNANT. </w:t>
+      </w:r>
+      <w:r>
+        <w:rPr>
+          <w:lang w:val="hr-HR"/>
+        </w:rPr>
+        <w:t xml:space="preserve">Zbog toga će biti potrebno da osim same preciznosti, kod evaluacije modela koristimo i druge metrike za performanse kao što su odziv, F1 </w:t>
+      </w:r>
+      <w:r>
+        <w:rPr>
+          <w:lang w:val="hr-HR"/>
+        </w:rPr>
+        <w:t>score</w:t>
+      </w:r>
+      <w:r>
+        <w:rPr>
+          <w:lang w:val="hr-HR"/>
+        </w:rPr>
+        <w:t xml:space="preserve"> i </w:t>
+      </w:r>
+      <w:r>
+        <w:t>ROC-AUC</w:t>
+      </w:r>
+      <w:r>
+        <w:t xml:space="preserve"> krivulje.</w:t>
+      </w:r>
+      <w:r>
+        <w:rPr>
+          <w:lang w:val="hr-HR"/>
+        </w:rPr>
+        <w:t xml:space="preserve"> </w:t>
+      </w:r>
+      <w:r>
+        <w:rPr>
+          <w:lang w:val="hr-HR"/>
+        </w:rPr>
+        <w:t xml:space="preserve">Osobe koje su napravile i objavile ovaj podatkovni skup te ga odvojile na skup za testiranje i treniranje su vjerojatno pazili na to da su podaci u skupu za treniranje balansirani s obzirom na značajku </w:t>
+      </w:r>
+      <w:r>
+        <w:rPr>
+          <w:i/>
+          <w:iCs/>
+          <w:lang w:val="hr-HR"/>
+        </w:rPr>
+        <w:t>Pathology</w:t>
+      </w:r>
+      <w:r>
+        <w:rPr>
+          <w:lang w:val="hr-HR"/>
+        </w:rPr>
+        <w:t xml:space="preserve"> kako bi modeli bili jednako pouzdani za klasifikaciju sve tri značajke. Analizom kompletnog podatkovnog skupa je također utvrđeno da se slike svakog pojedinog pacijenta nalaze ili u skupu za treniranje ili u skupu za testiranje, dakle niti jednom pacijentu različite izrezane verzije slika nisu završile u oba podatkovna skupa. Time je osigurana konzistentnost i sprječavanje da se model prenaučenosti jer je poanta da model može dobro predviđati za nove pacijente na čijim slikama nije već treniran.</w:t>
+      </w:r>
+    </w:p>
+    <w:p>
+      <w:pPr>
+        <w:pStyle w:val="BodyText"/>
+        <w:rPr>
+          <w:lang w:val="hr-HR"/>
+        </w:rPr>
+      </w:pPr>
     </w:p>
     <w:p>
       <w:pPr>
@@ -1460,7 +1497,10 @@
         <w:t>English, commas, semi</w:t>
       </w:r>
       <w:r>
-        <w:t>colons, periods, question and exclamation marks are located within quotation marks only when a complete thought or name is cited, such as a title or full quotation. When quotation marks are used, instead of a bold or italic typeface, to highlight a word or phrase, punctuation should appear outside of the quotation marks. A parenthetical phrase or statement at the end of a sentence is punctuated outside of the closing parenthesis (like this). (A parenthetical sentence is punctuated within the parentheses.)</w:t>
+        <w:t xml:space="preserve">colons, periods, question and exclamation marks are located within quotation marks only when a complete thought or name is cited, such as a title or full quotation. When quotation marks are used, instead of a bold or italic typeface, to highlight a word or phrase, punctuation should appear outside of the quotation marks. A parenthetical phrase or statement at the end of a </w:t>
+      </w:r>
+      <w:r>
+        <w:t>sentence is punctuated outside of the closing parenthesis (like this). (A parenthetical sentence is punctuated within the parentheses.)</w:t>
       </w:r>
     </w:p>
     <w:p>
@@ -1698,7 +1738,6 @@
         <w:pStyle w:val="Heading4"/>
       </w:pPr>
       <w:r>
-        <w:lastRenderedPageBreak/>
         <w:t>Selection</w:t>
       </w:r>
       <w:r>
@@ -1778,6 +1817,7 @@
         <w:pStyle w:val="Heading2"/>
       </w:pPr>
       <w:r>
+        <w:lastRenderedPageBreak/>
         <w:t>Identify</w:t>
       </w:r>
       <w:r>
@@ -2113,10 +2153,7 @@
         <w:pStyle w:val="BodyText"/>
       </w:pPr>
       <w:r>
-        <w:t xml:space="preserve">Figure Labels: Use 8 point Times New Roman for Figure labels. Use words rather than symbols or abbreviations when writing Figure axis labels to avoid confusing the reader. As an example, write the quantity “Magnetization”, or “Magnetization, M”, not just “M”. If including units in the label, present them within parentheses. Do not label axes only </w:t>
-      </w:r>
-      <w:r>
-        <w:t>with units. In the example, write “Magnetization (A/m)” or “Magnetization {A[m(1)]}”, not just “A/m”. Do not label axes</w:t>
+        <w:t>Figure Labels: Use 8 point Times New Roman for Figure labels. Use words rather than symbols or abbreviations when writing Figure axis labels to avoid confusing the reader. As an example, write the quantity “Magnetization”, or “Magnetization, M”, not just “M”. If including units in the label, present them within parentheses. Do not label axes only with units. In the example, write “Magnetization (A/m)” or “Magnetization {A[m(1)]}”, not just “A/m”. Do not label axes</w:t>
       </w:r>
       <w:r>
         <w:t xml:space="preserve"> </w:t>
@@ -2168,7 +2205,6 @@
       <w:r>
         <w:t>”. Avoid the stilted expression “</w:t>
       </w:r>
-      <w:proofErr w:type="spellStart"/>
       <w:r>
         <w:rPr>
           <w:lang w:val="en-US"/>
@@ -2176,11 +2212,7 @@
         <w:t>o</w:t>
       </w:r>
       <w:r>
-        <w:t>ne</w:t>
-      </w:r>
-      <w:proofErr w:type="spellEnd"/>
-      <w:r>
-        <w:t xml:space="preserve"> of us (R. B. G.) thanks </w:t>
+        <w:t xml:space="preserve">ne of us (R. B. G.) thanks </w:t>
       </w:r>
       <w:r>
         <w:t>...</w:t>
@@ -2304,7 +2336,7 @@
       <w:r>
         <w:t xml:space="preserve">World Health Organisation. Breast cancer. Pristupljeno: 30.10.2024. </w:t>
       </w:r>
-      <w:hyperlink r:id="rId10" w:history="1">
+      <w:hyperlink r:id="rId14" w:history="1">
         <w:r>
           <w:rPr>
             <w:rStyle w:val="Hyperlink"/>
@@ -2321,7 +2353,7 @@
       <w:r>
         <w:t xml:space="preserve">Hrvatski zavod za javno zdravstvo. Što trebate znati o raku dojke? Pristupljeno: 30.10.2024. </w:t>
       </w:r>
-      <w:hyperlink r:id="rId11" w:history="1">
+      <w:hyperlink r:id="rId15" w:history="1">
         <w:r>
           <w:rPr>
             <w:rStyle w:val="Hyperlink"/>
@@ -2343,6 +2375,11 @@
       <w:pPr>
         <w:pStyle w:val="references"/>
         <w:ind w:start="17.70pt" w:hanging="17.70pt"/>
+        <w:rPr>
+          <w:rStyle w:val="Hyperlink"/>
+          <w:color w:val="auto"/>
+          <w:u w:val="none"/>
+        </w:rPr>
       </w:pPr>
       <w:r>
         <w:t xml:space="preserve">Rongrong Guo. Guolan Lu. Baowei Fei. </w:t>
@@ -2357,7 +2394,7 @@
       <w:r>
         <w:t xml:space="preserve"> Pristupljeno: 2.11.2024. </w:t>
       </w:r>
-      <w:hyperlink r:id="rId12" w:history="1">
+      <w:hyperlink r:id="rId16" w:history="1">
         <w:r>
           <w:rPr>
             <w:rStyle w:val="Hyperlink"/>
@@ -2365,6 +2402,29 @@
           <w:t>https://pmc.ncbi.nlm.nih.gov/articles/PMC6169997/</w:t>
         </w:r>
       </w:hyperlink>
+    </w:p>
+    <w:p>
+      <w:pPr>
+        <w:pStyle w:val="references"/>
+        <w:ind w:start="17.70pt" w:hanging="17.70pt"/>
+      </w:pPr>
+      <w:r>
+        <w:t>CBIS-DDSM: Breast Cancer Image Dataset</w:t>
+      </w:r>
+      <w:r>
+        <w:br/>
+      </w:r>
+      <w:hyperlink r:id="rId17" w:history="1">
+        <w:r>
+          <w:rPr>
+            <w:rStyle w:val="Hyperlink"/>
+          </w:rPr>
+          <w:t>https://www.kaggle.com/datasets/awsaf49/cbis-ddsm-breast-cancer-image-dataset?resource=download</w:t>
+        </w:r>
+      </w:hyperlink>
+      <w:r>
+        <w:t xml:space="preserve"> </w:t>
+      </w:r>
     </w:p>
     <w:p>
       <w:pPr>
@@ -4492,6 +4552,7 @@
   <w:style w:type="character" w:default="1" w:styleId="DefaultParagraphFont">
     <w:name w:val="Default Paragraph Font"/>
     <w:uiPriority w:val="1"/>
+    <w:semiHidden/>
     <w:unhideWhenUsed/>
   </w:style>
   <w:style w:type="table" w:default="1" w:styleId="TableNormal">

</xml_diff>